<commit_message>
PR9: audit fixes (shared-zero hole item, negative-leading item, coverage notes, su1 reasoning, slip wording, test-point markers), audit md, README row; PR8 number line and entities touch-up
Co-Authored-By: Claude Opus 5.5 <noreply@anthropic.com>
Claude-Session: https://claude.ai/code/session_013Y8PfETWcMLvmUEpCdE8Wq
</commit_message>
<xml_diff>
--- a/support-materials/PR9/PR9_worked_examples.docx
+++ b/support-materials/PR9/PR9_worked_examples.docx
@@ -131,7 +131,7 @@
         <w:spacing w:after="120" w:before="80" w:line="300"/>
       </w:pPr>
       <w:r>
-        <w:t xml:space="preserve">Why not just multiply both sides by (x − 3)(x − 4) to clear the fractions?</w:t>
+        <w:t xml:space="preserve">At x = 3.5, what is the sign of (x − 3)(x − 4), and why does that matter for multiplying both sides by it?</w:t>
       </w:r>
     </w:p>
     <w:p>
@@ -147,7 +147,7 @@
         <w:t xml:space="preserve">A.  </w:t>
       </w:r>
       <w:r>
-        <w:t xml:space="preserve">Multiplying makes the fractions bigger, which changes the answer.</w:t>
+        <w:t xml:space="preserve">Positive, since both factors are near 3 or 4, so multiplying is safe.</w:t>
       </w:r>
     </w:p>
     <w:p>
@@ -163,7 +163,7 @@
         <w:t xml:space="preserve">B.  </w:t>
       </w:r>
       <w:r>
-        <w:t xml:space="preserve">You can; that is the quickest way to solve any inequality.</w:t>
+        <w:t xml:space="preserve">Zero, so multiplying would wipe out both sides of the inequality.</w:t>
       </w:r>
     </w:p>
     <w:p>
@@ -179,7 +179,7 @@
         <w:t xml:space="preserve">C.  </w:t>
       </w:r>
       <w:r>
-        <w:t xml:space="preserve">Its sign changes with x, and a negative would flip the inequality.</w:t>
+        <w:t xml:space="preserve">Negative there, so it would flip the inequality for only some x.</w:t>
       </w:r>
     </w:p>
     <w:p>
@@ -195,7 +195,7 @@
         <w:t xml:space="preserve">D.  </w:t>
       </w:r>
       <w:r>
-        <w:t xml:space="preserve">It is never 0, so multiplying by it does nothing useful.</w:t>
+        <w:t xml:space="preserve">Negative, but what you multiply by never affects the inequality.</w:t>
       </w:r>
     </w:p>
     <w:p>
@@ -212,17 +212,14 @@
         <w:spacing w:after="120" w:before="80" w:line="300"/>
       </w:pPr>
       <w:r>
-        <w:t xml:space="preserve">With an equation you could multiply, but an inequality flips when you multiply by a negative. </w:t>
-      </w:r>
-      <w:r>
-        <w:rPr>
-          <w:i/>
-          <w:iCs/>
-        </w:rPr>
-        <w:t xml:space="preserve">(x−3)(x−4)</w:t>
-      </w:r>
-      <w:r>
-        <w:t xml:space="preserve"> is positive for some </w:t>
+        <w:rPr>
+          <w:i/>
+          <w:iCs/>
+        </w:rPr>
+        <w:t xml:space="preserve">(3.5−3)(3.5−4)=(0.5)(−0.5)=−0.25</w:t>
+      </w:r>
+      <w:r>
+        <w:t xml:space="preserve">, negative. Between 3 and 4 the product is negative, and outside that it is positive, so multiplying would flip the inequality for some </w:t>
       </w:r>
       <w:r>
         <w:rPr>
@@ -232,24 +229,24 @@
         <w:t xml:space="preserve">x</w:t>
       </w:r>
       <w:r>
-        <w:t xml:space="preserve"> and negative for others, between 3 and 4, so there is no single right direction. Subtracting to get one fraction against 0 avoids the problem. Multiplying by a positive number does not change the answer; "any inequality" is the trap; and </w:t>
-      </w:r>
-      <w:r>
-        <w:rPr>
-          <w:i/>
-          <w:iCs/>
-        </w:rPr>
-        <w:t xml:space="preserve">(x−3)(x−4)</w:t>
-      </w:r>
-      <w:r>
-        <w:t xml:space="preserve"> is 0 at 3 and 4, which matter a lot. </w:t>
-      </w:r>
-      <w:r>
-        <w:rPr>
-          <w:b/>
-          <w:bCs/>
-        </w:rPr>
-        <w:t xml:space="preserve">Its sign changes with x, and a negative would flip the inequality.</w:t>
+        <w:t xml:space="preserve"> and not for others, with no single right direction. Subtracting to get one fraction against 0 avoids the problem. "Positive" misses that </w:t>
+      </w:r>
+      <w:r>
+        <w:rPr>
+          <w:i/>
+          <w:iCs/>
+        </w:rPr>
+        <w:t xml:space="preserve">3.5−4</w:t>
+      </w:r>
+      <w:r>
+        <w:t xml:space="preserve"> is negative; the product is 0 only at 3 and 4 themselves; and multiplying by a negative is exactly what flips an inequality. </w:t>
+      </w:r>
+      <w:r>
+        <w:rPr>
+          <w:b/>
+          <w:bCs/>
+        </w:rPr>
+        <w:t xml:space="preserve">Negative there, so multiplying would flip the inequality for only some x.</w:t>
       </w:r>
     </w:p>
     <w:p>
@@ -728,7 +725,7 @@
         <w:t xml:space="preserve">B.  </w:t>
       </w:r>
       <w:r>
-        <w:t xml:space="preserve">Only 1</w:t>
+        <w:t xml:space="preserve">Only 1, where the top is 0</w:t>
       </w:r>
     </w:p>
     <w:p>
@@ -1094,7 +1091,7 @@
         <w:pageBreakBefore/>
       </w:pPr>
       <w:r>
-        <w:t xml:space="preserve">Example 6: One Factor Each</w:t>
+        <w:t xml:space="preserve">Example 6: A Shared Zero</w:t>
       </w:r>
     </w:p>
     <w:p>
@@ -1109,7 +1106,7 @@
           <w:sz w:val="40"/>
           <w:szCs w:val="40"/>
         </w:rPr>
-        <w:t xml:space="preserve">(x−2)/(x+3)≥ 0</w:t>
+        <w:t xml:space="preserve">(x−6)/(x−6)≥(x−6)/(x−5)</w:t>
       </w:r>
     </w:p>
     <w:p>
@@ -1126,7 +1123,7 @@
         <w:spacing w:after="120" w:before="80" w:line="300"/>
       </w:pPr>
       <w:r>
-        <w:t xml:space="preserve">Solve. Which is the answer?</w:t>
+        <w:t xml:space="preserve">CheckIt sometimes gives a problem like this. Solve. Which is the answer?</w:t>
       </w:r>
     </w:p>
     <w:p>
@@ -1142,11 +1139,7 @@
         <w:t xml:space="preserve">A.  </w:t>
       </w:r>
       <w:r>
-        <w:rPr>
-          <w:i/>
-          <w:iCs/>
-        </w:rPr>
-        <w:t xml:space="preserve">(−∞,−3]∪[2,∞)</w:t>
+        <w:t xml:space="preserve">(5, ∞)</w:t>
       </w:r>
     </w:p>
     <w:p>
@@ -1162,11 +1155,7 @@
         <w:t xml:space="preserve">B.  </w:t>
       </w:r>
       <w:r>
-        <w:rPr>
-          <w:i/>
-          <w:iCs/>
-        </w:rPr>
-        <w:t xml:space="preserve">[−3,2]</w:t>
+        <w:t xml:space="preserve">[6, ∞)</w:t>
       </w:r>
     </w:p>
     <w:p>
@@ -1182,11 +1171,7 @@
         <w:t xml:space="preserve">C.  </w:t>
       </w:r>
       <w:r>
-        <w:rPr>
-          <w:i/>
-          <w:iCs/>
-        </w:rPr>
-        <w:t xml:space="preserve">(−3,2]</w:t>
+        <w:t xml:space="preserve">(−∞, 5) ∪ (6, ∞)</w:t>
       </w:r>
     </w:p>
     <w:p>
@@ -1202,11 +1187,7 @@
         <w:t xml:space="preserve">D.  </w:t>
       </w:r>
       <w:r>
-        <w:rPr>
-          <w:i/>
-          <w:iCs/>
-        </w:rPr>
-        <w:t xml:space="preserve">(−∞,−3)∪[2,∞)</w:t>
+        <w:t xml:space="preserve">(5, 6) ∪ (6, ∞)</w:t>
       </w:r>
     </w:p>
     <w:p>
@@ -1223,36 +1204,86 @@
         <w:spacing w:after="120" w:before="80" w:line="300"/>
       </w:pPr>
       <w:r>
-        <w:t xml:space="preserve">Critical points −3 (bottom) and 2 (top). Left of −3, both factors are negative, so the fraction is positive; between them, it is negative; right of 2, positive. Keep the positive pieces. Include 2, where the fraction is 0, but not −3, where it is undefined. A bracket at −3 includes a point where the fraction does not exist; </w:t>
-      </w:r>
-      <w:r>
-        <w:rPr>
-          <w:i/>
-          <w:iCs/>
-        </w:rPr>
-        <w:t xml:space="preserve">[−3,2]</w:t>
-      </w:r>
-      <w:r>
-        <w:t xml:space="preserve"> and </w:t>
-      </w:r>
-      <w:r>
-        <w:rPr>
-          <w:i/>
-          <w:iCs/>
-        </w:rPr>
-        <w:t xml:space="preserve">(−3,2]</w:t>
-      </w:r>
-      <w:r>
-        <w:t xml:space="preserve"> are the negative middle. </w:t>
-      </w:r>
-      <w:r>
-        <w:rPr>
-          <w:b/>
-          <w:bCs/>
-          <w:i/>
-          <w:iCs/>
-        </w:rPr>
-        <w:t xml:space="preserve">(−∞,−3)∪[2,∞)</w:t>
+        <w:t xml:space="preserve">Subtract and combine: </w:t>
+      </w:r>
+      <w:r>
+        <w:rPr>
+          <w:i/>
+          <w:iCs/>
+        </w:rPr>
+        <w:t xml:space="preserve">((x−6)(x−5)−(x−6)(x−6))/((x−6)(x−5))=((x−6)[(x−5)−(x−6)])/((x−6)(x−5))=(x−6)/((x−6)(x−5))≥ 0</w:t>
+      </w:r>
+      <w:r>
+        <w:t xml:space="preserve">. The top and the bottom are both 0 at 6, so the fraction is undefined there, a hole, even though the top is 0. Everywhere else it equals </w:t>
+      </w:r>
+      <w:r>
+        <w:rPr>
+          <w:i/>
+          <w:iCs/>
+        </w:rPr>
+        <w:t xml:space="preserve">1/(x−5)</w:t>
+      </w:r>
+      <w:r>
+        <w:t xml:space="preserve">, which is positive exactly when </w:t>
+      </w:r>
+      <w:r>
+        <w:rPr>
+          <w:i/>
+          <w:iCs/>
+        </w:rPr>
+        <w:t xml:space="preserve">x&gt;5</w:t>
+      </w:r>
+      <w:r>
+        <w:t xml:space="preserve">. So keep everything right of 5, except 6. </w:t>
+      </w:r>
+      <w:r>
+        <w:rPr>
+          <w:i/>
+          <w:iCs/>
+        </w:rPr>
+        <w:t xml:space="preserve">(5,∞)</w:t>
+      </w:r>
+      <w:r>
+        <w:t xml:space="preserve"> forgets that 6 is undefined; </w:t>
+      </w:r>
+      <w:r>
+        <w:rPr>
+          <w:i/>
+          <w:iCs/>
+        </w:rPr>
+        <w:t xml:space="preserve">[6,∞)</w:t>
+      </w:r>
+      <w:r>
+        <w:t xml:space="preserve"> includes 6 because the top is 0 there; and </w:t>
+      </w:r>
+      <w:r>
+        <w:rPr>
+          <w:i/>
+          <w:iCs/>
+        </w:rPr>
+        <w:t xml:space="preserve">(−∞,5)∪(6,∞)</w:t>
+      </w:r>
+      <w:r>
+        <w:t xml:space="preserve"> treats 6 as a place where the sign changes, but testing 5.5 gives </w:t>
+      </w:r>
+      <w:r>
+        <w:rPr>
+          <w:i/>
+          <w:iCs/>
+        </w:rPr>
+        <w:t xml:space="preserve">1/0.5&gt;0</w:t>
+      </w:r>
+      <w:r>
+        <w:t xml:space="preserve">. </w:t>
+      </w:r>
+      <w:r>
+        <w:rPr>
+          <w:b/>
+          <w:bCs/>
+          <w:i/>
+          <w:iCs/>
+        </w:rPr>
+        <w:t xml:space="preserve">(5,6)∪(6,∞)</w:t>
       </w:r>
       <w:r>
         <w:rPr>
@@ -1569,7 +1600,7 @@
         <w:t xml:space="preserve">(−∞,−10)∪(−4,−1)∪(2,∞)</w:t>
       </w:r>
       <w:r>
-        <w:t xml:space="preserve">. It is not just 0 that fails, more tests in the same interval would agree with the first, and a failing test never puts its interval in the answer. </w:t>
+        <w:t xml:space="preserve">. It is not just 0 that fails; more tests in the same interval would agree with the first, and a failing test never puts its interval in the answer. </w:t>
       </w:r>
       <w:r>
         <w:rPr>
@@ -1779,7 +1810,7 @@
         <w:t xml:space="preserve">∪</w:t>
       </w:r>
       <w:r>
-        <w:t xml:space="preserve">. A bracket at 1 ignores its open dot; parentheses at −2 and 3 ignore their closed dots; and infinity always gets a parenthesis. In a rational inequality, an open dot inside an otherwise closed piece usually marks a zero of the bottom. </w:t>
+        <w:t xml:space="preserve">. A bracket at 1 ignores its open dot; parentheses at −2 and 3 ignore their closed dots; and infinity always gets a parenthesis. With ≤ or ≥, an open dot next to a closed one marks a place where the bottom is 0. </w:t>
       </w:r>
       <w:r>
         <w:rPr>
@@ -2247,7 +2278,7 @@
         <w:pageBreakBefore/>
       </w:pPr>
       <w:r>
-        <w:t xml:space="preserve">Example 12: Notation to Line</w:t>
+        <w:t xml:space="preserve">Example 12: A Negative Out Front</w:t>
       </w:r>
     </w:p>
     <w:p>
@@ -2262,7 +2293,7 @@
           <w:sz w:val="40"/>
           <w:szCs w:val="40"/>
         </w:rPr>
-        <w:t xml:space="preserve">(−4,1]∪(3,∞)</w:t>
+        <w:t xml:space="preserve">(x−2)/(x+2)≤(x−1)/(x+1)</w:t>
       </w:r>
     </w:p>
     <w:p>
@@ -2279,7 +2310,17 @@
         <w:spacing w:after="120" w:before="80" w:line="300"/>
       </w:pPr>
       <w:r>
-        <w:t xml:space="preserve">Which number line shows this answer?</w:t>
+        <w:t xml:space="preserve">Combining gives </w:t>
+      </w:r>
+      <w:r>
+        <w:rPr>
+          <w:i/>
+          <w:iCs/>
+        </w:rPr>
+        <w:t xml:space="preserve">(−2x)/((x+1)(x+2))≤ 0</w:t>
+      </w:r>
+      <w:r>
+        <w:t xml:space="preserve">. Solve. Which is the answer?</w:t>
       </w:r>
     </w:p>
     <w:p>
@@ -2295,7 +2336,7 @@
         <w:t xml:space="preserve">A.  </w:t>
       </w:r>
       <w:r>
-        <w:t xml:space="preserve">Open dot at −4, closed at 1, shaded between; closed dot at 3, shaded right</w:t>
+        <w:t xml:space="preserve">(−∞, −2) ∪ (−1, 0]</w:t>
       </w:r>
     </w:p>
     <w:p>
@@ -2311,7 +2352,7 @@
         <w:t xml:space="preserve">B.  </w:t>
       </w:r>
       <w:r>
-        <w:t xml:space="preserve">Closed dot at −4, open at 1, shaded between; open dot at 3, shaded right</w:t>
+        <w:t xml:space="preserve">[−2, −1] ∪ [0, ∞)</w:t>
       </w:r>
     </w:p>
     <w:p>
@@ -2327,7 +2368,7 @@
         <w:t xml:space="preserve">C.  </w:t>
       </w:r>
       <w:r>
-        <w:t xml:space="preserve">Open dot at −4, closed at 1, shaded outside them; open dot at 3, shaded left</w:t>
+        <w:t xml:space="preserve">[0, ∞)</w:t>
       </w:r>
     </w:p>
     <w:p>
@@ -2343,7 +2384,7 @@
         <w:t xml:space="preserve">D.  </w:t>
       </w:r>
       <w:r>
-        <w:t xml:space="preserve">Open dot at −4, closed at 1, shaded between; open dot at 3, shaded right</w:t>
+        <w:t xml:space="preserve">(−2, −1) ∪ [0, ∞)</w:t>
       </w:r>
     </w:p>
     <w:p>
@@ -2360,14 +2401,103 @@
         <w:spacing w:after="120" w:before="80" w:line="300"/>
       </w:pPr>
       <w:r>
-        <w:t xml:space="preserve">A parenthesis means an open dot and a bracket means a closed dot. So: open at −4 and closed at 1, with the segment between them shaded; then open at 3, with the ray to the right shaded and an arrow. A closed dot at 3 ignores its parenthesis; swapping open and closed reads the symbols backwards; and shading outside or to the left draws different pieces. </w:t>
-      </w:r>
-      <w:r>
-        <w:rPr>
-          <w:b/>
-          <w:bCs/>
-        </w:rPr>
-        <w:t xml:space="preserve">Open at −4, closed at 1, shaded between; open at 3, shaded right.</w:t>
+        <w:t xml:space="preserve">The top is </w:t>
+      </w:r>
+      <w:r>
+        <w:rPr>
+          <w:i/>
+          <w:iCs/>
+        </w:rPr>
+        <w:t xml:space="preserve">(x−2)(x+1)−(x−1)(x+2)=(x</w:t>
+      </w:r>
+      <w:r>
+        <w:rPr>
+          <w:i/>
+          <w:iCs/>
+          <w:vertAlign w:val="superscript"/>
+        </w:rPr>
+        <w:t xml:space="preserve">2</w:t>
+      </w:r>
+      <w:r>
+        <w:rPr>
+          <w:i/>
+          <w:iCs/>
+        </w:rPr>
+        <w:t xml:space="preserve">−x−2)−(x</w:t>
+      </w:r>
+      <w:r>
+        <w:rPr>
+          <w:i/>
+          <w:iCs/>
+          <w:vertAlign w:val="superscript"/>
+        </w:rPr>
+        <w:t xml:space="preserve">2</w:t>
+      </w:r>
+      <w:r>
+        <w:rPr>
+          <w:i/>
+          <w:iCs/>
+        </w:rPr>
+        <w:t xml:space="preserve">+x−2)=−2x</w:t>
+      </w:r>
+      <w:r>
+        <w:t xml:space="preserve">. Critical points −2, −1, 0. Count the −2 out front as one more negative factor. Left of −2: </w:t>
+      </w:r>
+      <w:r>
+        <w:rPr>
+          <w:i/>
+          <w:iCs/>
+        </w:rPr>
+        <w:t xml:space="preserve">−2x</w:t>
+      </w:r>
+      <w:r>
+        <w:t xml:space="preserve"> is positive and both bottom factors are negative, so the fraction is positive. Between −2 and −1: negative. Between −1 and 0: positive. Right of 0: </w:t>
+      </w:r>
+      <w:r>
+        <w:rPr>
+          <w:i/>
+          <w:iCs/>
+        </w:rPr>
+        <w:t xml:space="preserve">−2x</w:t>
+      </w:r>
+      <w:r>
+        <w:t xml:space="preserve"> is negative, so negative. Keep the negative pieces, include 0, where the fraction is 0, and leave out −2 and −1. </w:t>
+      </w:r>
+      <w:r>
+        <w:rPr>
+          <w:i/>
+          <w:iCs/>
+        </w:rPr>
+        <w:t xml:space="preserve">(−∞,−2)∪(−1,0]</w:t>
+      </w:r>
+      <w:r>
+        <w:t xml:space="preserve"> forgets the −2 and gets every sign backwards; brackets at −2 and −1 include undefined points; and </w:t>
+      </w:r>
+      <w:r>
+        <w:rPr>
+          <w:i/>
+          <w:iCs/>
+        </w:rPr>
+        <w:t xml:space="preserve">[0,∞)</w:t>
+      </w:r>
+      <w:r>
+        <w:t xml:space="preserve"> comes from cross-multiplying, which ignores the sign of the bottoms. </w:t>
+      </w:r>
+      <w:r>
+        <w:rPr>
+          <w:b/>
+          <w:bCs/>
+          <w:i/>
+          <w:iCs/>
+        </w:rPr>
+        <w:t xml:space="preserve">(−2,−1)∪[0,∞)</w:t>
+      </w:r>
+      <w:r>
+        <w:rPr>
+          <w:b/>
+          <w:bCs/>
+        </w:rPr>
+        <w:t xml:space="preserve">.</w:t>
       </w:r>
     </w:p>
     <w:p>
@@ -2501,7 +2631,7 @@
         <w:t xml:space="preserve">C.  </w:t>
       </w:r>
       <w:r>
-        <w:t xml:space="preserve">The expansion is off: (x + 5)(x + 3) is x² + 15, so then x &gt; 4.</w:t>
+        <w:t xml:space="preserve">The expansion is off: (x + 5)(x + 3) is x² + 15, so every x works.</w:t>
       </w:r>
     </w:p>
     <w:p>
@@ -2584,7 +2714,57 @@
         <w:t xml:space="preserve">1/3</w:t>
       </w:r>
       <w:r>
-        <w:t xml:space="preserve">. The expansion was right, and </w:t>
+        <w:t xml:space="preserve">. The expansion was right: </w:t>
+      </w:r>
+      <w:r>
+        <w:rPr>
+          <w:i/>
+          <w:iCs/>
+        </w:rPr>
+        <w:t xml:space="preserve">(x+5)(x+3)=x</w:t>
+      </w:r>
+      <w:r>
+        <w:rPr>
+          <w:i/>
+          <w:iCs/>
+          <w:vertAlign w:val="superscript"/>
+        </w:rPr>
+        <w:t xml:space="preserve">2</w:t>
+      </w:r>
+      <w:r>
+        <w:rPr>
+          <w:i/>
+          <w:iCs/>
+        </w:rPr>
+        <w:t xml:space="preserve">+8x+15</w:t>
+      </w:r>
+      <w:r>
+        <w:t xml:space="preserve">, not </w:t>
+      </w:r>
+      <w:r>
+        <w:rPr>
+          <w:i/>
+          <w:iCs/>
+        </w:rPr>
+        <w:t xml:space="preserve">x</w:t>
+      </w:r>
+      <w:r>
+        <w:rPr>
+          <w:i/>
+          <w:iCs/>
+          <w:vertAlign w:val="superscript"/>
+        </w:rPr>
+        <w:t xml:space="preserve">2</w:t>
+      </w:r>
+      <w:r>
+        <w:rPr>
+          <w:i/>
+          <w:iCs/>
+        </w:rPr>
+        <w:t xml:space="preserve">+15</w:t>
+      </w:r>
+      <w:r>
+        <w:t xml:space="preserve">, and </w:t>
       </w:r>
       <w:r>
         <w:rPr>
@@ -2940,7 +3120,17 @@
         <w:t xml:space="preserve">1/6&gt;0</w:t>
       </w:r>
       <w:r>
-        <w:t xml:space="preserve">. Keep the positive pieces, all open: 3 gives 0, which </w:t>
+        <w:t xml:space="preserve">. Keep the positive pieces (the middle piece, where the test was negative, is what </w:t>
+      </w:r>
+      <w:r>
+        <w:rPr>
+          <w:i/>
+          <w:iCs/>
+        </w:rPr>
+        <w:t xml:space="preserve">&lt;</w:t>
+      </w:r>
+      <w:r>
+        <w:t xml:space="preserve"> would want), all open: 3 gives 0, which </w:t>
       </w:r>
       <w:r>
         <w:rPr>
@@ -2998,7 +3188,7 @@
         <w:spacing w:after="120" w:before="80" w:line="300"/>
       </w:pPr>
       <w:r>
-        <w:t xml:space="preserve">A student used only the critical point −1, from the top. Testing −2 gave a positive and testing 0 gave a negative, so they answered (−1, ∞). What is the mistake, if any?</w:t>
+        <w:t xml:space="preserve">A student found the critical point −1, tested −2 (positive) and 0 (negative), and answered (−1, ∞). What is the mistake, if any?</w:t>
       </w:r>
     </w:p>
     <w:p>

</xml_diff>